<commit_message>
Dev handoff: separate carousel images per PDP; dev template snapshots
Co-Authored-By: Claude Opus 5.5 <noreply@anthropic.com>
Claude-Session: https://claude.ai/code/session_01YUaqMprd9jDWbjH8Lh4n9H
</commit_message>
<xml_diff>
--- a/handoff/MUTO_Dev_Handoff_PDPs_13Oct2026.docx
+++ b/handoff/MUTO_Dev_Handoff_PDPs_13Oct2026.docx
@@ -154,10 +154,10 @@
           <w:bCs/>
           <w:b/>
         </w:rPr>
-        <w:t xml:space="preserve">template changes on 4 products</w:t>
-      </w:r>
-      <w:r>
-        <w:t xml:space="preserve">.</w:t>
+        <w:t xml:space="preserve">template changes on 3 products</w:t>
+      </w:r>
+      <w:r>
+        <w:t xml:space="preserve">, plus product images so each page has its own carousel.</w:t>
       </w:r>
     </w:p>
     <w:bookmarkStart w:id="23" w:name="before-you-start"/>
@@ -1270,31 +1270,289 @@
       </w:r>
     </w:p>
     <w:bookmarkEnd w:id="25"/>
-    <w:bookmarkStart w:id="28" w:name="whats-on-each-page"/>
+    <w:bookmarkStart w:id="26" w:name="X3eb5eb3dca585f99a6207a2ab7e910b45d96904"/>
     <w:p>
       <w:pPr>
         <w:pStyle w:val="Heading1"/>
       </w:pPr>
       <w:r>
-        <w:t xml:space="preserve">What’s on each page</w:t>
-      </w:r>
-    </w:p>
-    <w:bookmarkStart w:id="26" w:name="main-page-muto-nad-performance"/>
-    <w:p>
-      <w:pPr>
-        <w:pStyle w:val="Heading2"/>
-      </w:pPr>
-      <w:r>
-        <w:t xml:space="preserve">Main page (</w:t>
-      </w:r>
-      <w:r>
-        <w:rPr>
-          <w:rStyle w:val="VerbatimChar"/>
-        </w:rPr>
-        <w:t xml:space="preserve">muto-nad-performance</w:t>
-      </w:r>
-      <w:r>
-        <w:t xml:space="preserve">)</w:t>
+        <w:t xml:space="preserve">Product carousel images: separate for each page</w:t>
+      </w:r>
+    </w:p>
+    <w:p>
+      <w:pPr>
+        <w:pStyle w:val="FirstParagraph"/>
+      </w:pPr>
+      <w:r>
+        <w:t xml:space="preserve">Each URL is its</w:t>
+      </w:r>
+      <w:r>
+        <w:t xml:space="preserve"> </w:t>
+      </w:r>
+      <w:r>
+        <w:rPr>
+          <w:bCs/>
+          <w:b/>
+        </w:rPr>
+        <w:t xml:space="preserve">own product</w:t>
+      </w:r>
+      <w:r>
+        <w:t xml:space="preserve">, and every page takes its carousel from</w:t>
+      </w:r>
+      <w:r>
+        <w:t xml:space="preserve"> </w:t>
+      </w:r>
+      <w:r>
+        <w:rPr>
+          <w:bCs/>
+          <w:b/>
+        </w:rPr>
+        <w:t xml:space="preserve">that product’s Media</w:t>
+      </w:r>
+      <w:r>
+        <w:t xml:space="preserve"> </w:t>
+      </w:r>
+      <w:r>
+        <w:t xml:space="preserve">(Products → product → Media, shown in that order). So each page’s images are already independent: change one product’s media and only that page changes.</w:t>
+      </w:r>
+    </w:p>
+    <w:tbl>
+      <w:tblPr>
+        <w:tblStyle w:val="Table"/>
+        <w:tblW w:type="pct" w:w="5000"/>
+        <w:tblLook w:firstRow="1" w:lastRow="0" w:firstColumn="0" w:lastColumn="0" w:noHBand="0" w:noVBand="0" w:val="0020"/>
+        <w:jc w:val="start"/>
+      </w:tblPr>
+      <w:tblGrid>
+        <w:gridCol w:w="2640"/>
+        <w:gridCol w:w="2640"/>
+        <w:gridCol w:w="2640"/>
+      </w:tblGrid>
+      <w:tr>
+        <w:trPr>
+          <w:tblHeader w:val="true"/>
+        </w:trPr>
+        <w:tc>
+          <w:tcPr/>
+          <w:p>
+            <w:pPr>
+              <w:pStyle w:val="Compact"/>
+              <w:jc w:val="left"/>
+            </w:pPr>
+            <w:r>
+              <w:t xml:space="preserve">Page</w:t>
+            </w:r>
+          </w:p>
+        </w:tc>
+        <w:tc>
+          <w:tcPr/>
+          <w:p>
+            <w:pPr>
+              <w:pStyle w:val="Compact"/>
+              <w:jc w:val="left"/>
+            </w:pPr>
+            <w:r>
+              <w:t xml:space="preserve">How its carousel is sourced</w:t>
+            </w:r>
+          </w:p>
+        </w:tc>
+        <w:tc>
+          <w:tcPr/>
+          <w:p>
+            <w:pPr>
+              <w:pStyle w:val="Compact"/>
+              <w:jc w:val="left"/>
+            </w:pPr>
+            <w:r>
+              <w:t xml:space="preserve">Product whose Media it shows</w:t>
+            </w:r>
+          </w:p>
+        </w:tc>
+      </w:tr>
+      <w:tr>
+        <w:tc>
+          <w:tcPr/>
+          <w:p>
+            <w:pPr>
+              <w:pStyle w:val="Compact"/>
+              <w:jc w:val="left"/>
+            </w:pPr>
+            <w:r>
+              <w:t xml:space="preserve">Main</w:t>
+            </w:r>
+          </w:p>
+        </w:tc>
+        <w:tc>
+          <w:tcPr/>
+          <w:p>
+            <w:pPr>
+              <w:pStyle w:val="Compact"/>
+              <w:jc w:val="left"/>
+            </w:pPr>
+            <w:r>
+              <w:rPr>
+                <w:rStyle w:val="VerbatimChar"/>
+              </w:rPr>
+              <w:t xml:space="preserve">muto-crea-buy</w:t>
+            </w:r>
+            <w:r>
+              <w:t xml:space="preserve"> </w:t>
+            </w:r>
+            <w:r>
+              <w:t xml:space="preserve">with</w:t>
+            </w:r>
+            <w:r>
+              <w:t xml:space="preserve"> </w:t>
+            </w:r>
+            <w:r>
+              <w:rPr>
+                <w:bCs/>
+                <w:b/>
+              </w:rPr>
+              <w:t xml:space="preserve">“</w:t>
+            </w:r>
+            <w:r>
+              <w:rPr>
+                <w:bCs/>
+                <w:b/>
+              </w:rPr>
+              <w:t xml:space="preserve">Use the product’s own images</w:t>
+            </w:r>
+            <w:r>
+              <w:rPr>
+                <w:bCs/>
+                <w:b/>
+              </w:rPr>
+              <w:t xml:space="preserve">”</w:t>
+            </w:r>
+            <w:r>
+              <w:t xml:space="preserve"> </w:t>
+            </w:r>
+            <w:r>
+              <w:t xml:space="preserve">on (</w:t>
+            </w:r>
+            <w:r>
+              <w:rPr>
+                <w:rStyle w:val="VerbatimChar"/>
+              </w:rPr>
+              <w:t xml:space="preserve">gallery_from_product: true</w:t>
+            </w:r>
+            <w:r>
+              <w:t xml:space="preserve">)</w:t>
+            </w:r>
+          </w:p>
+        </w:tc>
+        <w:tc>
+          <w:tcPr/>
+          <w:p>
+            <w:pPr>
+              <w:pStyle w:val="Compact"/>
+              <w:jc w:val="left"/>
+            </w:pPr>
+            <w:r>
+              <w:t xml:space="preserve">NAD+ Cellular Complex (main)</w:t>
+            </w:r>
+          </w:p>
+        </w:tc>
+      </w:tr>
+      <w:tr>
+        <w:tc>
+          <w:tcPr/>
+          <w:p>
+            <w:pPr>
+              <w:pStyle w:val="Compact"/>
+              <w:jc w:val="left"/>
+            </w:pPr>
+            <w:r>
+              <w:t xml:space="preserve">-2</w:t>
+            </w:r>
+          </w:p>
+        </w:tc>
+        <w:tc>
+          <w:tcPr/>
+          <w:p>
+            <w:pPr>
+              <w:pStyle w:val="Compact"/>
+              <w:jc w:val="left"/>
+            </w:pPr>
+            <w:r>
+              <w:t xml:space="preserve">Same setting, on</w:t>
+            </w:r>
+          </w:p>
+        </w:tc>
+        <w:tc>
+          <w:tcPr/>
+          <w:p>
+            <w:pPr>
+              <w:pStyle w:val="Compact"/>
+              <w:jc w:val="left"/>
+            </w:pPr>
+            <w:r>
+              <w:t xml:space="preserve">NAD+ Cellular Complex 2</w:t>
+            </w:r>
+          </w:p>
+        </w:tc>
+      </w:tr>
+      <w:tr>
+        <w:tc>
+          <w:tcPr/>
+          <w:p>
+            <w:pPr>
+              <w:pStyle w:val="Compact"/>
+              <w:jc w:val="left"/>
+            </w:pPr>
+            <w:r>
+              <w:t xml:space="preserve">-3, -4, -5</w:t>
+            </w:r>
+          </w:p>
+        </w:tc>
+        <w:tc>
+          <w:tcPr/>
+          <w:p>
+            <w:pPr>
+              <w:pStyle w:val="Compact"/>
+              <w:jc w:val="left"/>
+            </w:pPr>
+            <w:r>
+              <w:t xml:space="preserve">Your</w:t>
+            </w:r>
+            <w:r>
+              <w:t xml:space="preserve"> </w:t>
+            </w:r>
+            <w:r>
+              <w:rPr>
+                <w:rStyle w:val="VerbatimChar"/>
+              </w:rPr>
+              <w:t xml:space="preserve">main-product</w:t>
+            </w:r>
+            <w:r>
+              <w:t xml:space="preserve"> </w:t>
+            </w:r>
+            <w:r>
+              <w:t xml:space="preserve">section (standard product media gallery)</w:t>
+            </w:r>
+          </w:p>
+        </w:tc>
+        <w:tc>
+          <w:tcPr/>
+          <w:p>
+            <w:pPr>
+              <w:pStyle w:val="Compact"/>
+              <w:jc w:val="left"/>
+            </w:pPr>
+            <w:r>
+              <w:t xml:space="preserve">Each product’s own Media</w:t>
+            </w:r>
+          </w:p>
+        </w:tc>
+      </w:tr>
+    </w:tbl>
+    <w:p>
+      <w:pPr>
+        <w:pStyle w:val="BodyText"/>
+      </w:pPr>
+      <w:r>
+        <w:t xml:space="preserve">To do:</w:t>
       </w:r>
     </w:p>
     <w:p>
@@ -1306,23 +1564,72 @@
         <w:pStyle w:val="Compact"/>
       </w:pPr>
       <w:r>
-        <w:rPr>
-          <w:bCs/>
-          <w:b/>
-        </w:rPr>
-        <w:t xml:space="preserve">Buy box intro:</w:t>
-      </w:r>
-      <w:r>
-        <w:t xml:space="preserve"> </w:t>
-      </w:r>
-      <w:r>
-        <w:t xml:space="preserve">“</w:t>
-      </w:r>
-      <w:r>
-        <w:t xml:space="preserve">You’re doing more than ever. MUTO lets you see if it’s working. NR, which your body turns into NAD+, plus 18 supporting ingredients, every dose on the label. Two capsules with breakfast, then track your energy, recovery and stress on your wearable. 90 days to judge it, or your money back on subscriptions.</w:t>
-      </w:r>
-      <w:r>
-        <w:t xml:space="preserve">”</w:t>
+        <w:t xml:space="preserve">☐</w:t>
+      </w:r>
+      <w:r>
+        <w:t xml:space="preserve"> </w:t>
+      </w:r>
+      <w:r>
+        <w:rPr>
+          <w:bCs/>
+          <w:b/>
+        </w:rPr>
+        <w:t xml:space="preserve">-2 needs its own images.</w:t>
+      </w:r>
+      <w:r>
+        <w:t xml:space="preserve"> </w:t>
+      </w:r>
+      <w:r>
+        <w:t xml:space="preserve">It currently has 3 images (</w:t>
+      </w:r>
+      <w:r>
+        <w:rPr>
+          <w:rStyle w:val="VerbatimChar"/>
+        </w:rPr>
+        <w:t xml:space="preserve">newmain.png</w:t>
+      </w:r>
+      <w:r>
+        <w:t xml:space="preserve">,</w:t>
+      </w:r>
+      <w:r>
+        <w:t xml:space="preserve"> </w:t>
+      </w:r>
+      <w:r>
+        <w:rPr>
+          <w:rStyle w:val="VerbatimChar"/>
+        </w:rPr>
+        <w:t xml:space="preserve">Frame_2147230140.png</w:t>
+      </w:r>
+      <w:r>
+        <w:t xml:space="preserve">,</w:t>
+      </w:r>
+      <w:r>
+        <w:t xml:space="preserve"> </w:t>
+      </w:r>
+      <w:r>
+        <w:rPr>
+          <w:rStyle w:val="VerbatimChar"/>
+        </w:rPr>
+        <w:t xml:space="preserve">Frame_2147230136.png</w:t>
+      </w:r>
+      <w:r>
+        <w:t xml:space="preserve">), the same 3 as -3. Add the 45–55 carousel images to</w:t>
+      </w:r>
+      <w:r>
+        <w:t xml:space="preserve"> </w:t>
+      </w:r>
+      <w:r>
+        <w:rPr>
+          <w:bCs/>
+          <w:b/>
+        </w:rPr>
+        <w:t xml:space="preserve">NAD+ Cellular Complex 2 → Media</w:t>
+      </w:r>
+      <w:r>
+        <w:t xml:space="preserve"> </w:t>
+      </w:r>
+      <w:r>
+        <w:t xml:space="preserve">when they’re ready.</w:t>
       </w:r>
     </w:p>
     <w:p>
@@ -1334,29 +1641,137 @@
         <w:pStyle w:val="Compact"/>
       </w:pPr>
       <w:r>
-        <w:rPr>
-          <w:bCs/>
-          <w:b/>
-        </w:rPr>
-        <w:t xml:space="preserve">Banner:</w:t>
-      </w:r>
-      <w:r>
-        <w:t xml:space="preserve"> </w:t>
-      </w:r>
-      <w:r>
-        <w:t xml:space="preserve">“</w:t>
-      </w:r>
-      <w:r>
-        <w:t xml:space="preserve">Welcome kit worth £62, free with your first order</w:t>
-      </w:r>
-      <w:r>
-        <w:t xml:space="preserve">”</w:t>
-      </w:r>
-      <w:r>
-        <w:t xml:space="preserve"> </w:t>
-      </w:r>
-      <w:r>
-        <w:t xml:space="preserve">(as on your live creatine-kit page).</w:t>
+        <w:t xml:space="preserve">☐</w:t>
+      </w:r>
+      <w:r>
+        <w:t xml:space="preserve"> </w:t>
+      </w:r>
+      <w:r>
+        <w:rPr>
+          <w:bCs/>
+          <w:b/>
+        </w:rPr>
+        <w:t xml:space="preserve">-3 needs your</w:t>
+      </w:r>
+      <w:r>
+        <w:rPr>
+          <w:bCs/>
+          <w:b/>
+        </w:rPr>
+        <w:t xml:space="preserve"> </w:t>
+      </w:r>
+      <w:r>
+        <w:rPr>
+          <w:rStyle w:val="VerbatimChar"/>
+          <w:bCs/>
+          <w:b/>
+        </w:rPr>
+        <w:t xml:space="preserve">muto-3</w:t>
+      </w:r>
+      <w:r>
+        <w:rPr>
+          <w:bCs/>
+          <w:b/>
+        </w:rPr>
+        <w:t xml:space="preserve"> </w:t>
+      </w:r>
+      <w:r>
+        <w:rPr>
+          <w:bCs/>
+          <w:b/>
+        </w:rPr>
+        <w:t xml:space="preserve">images.</w:t>
+      </w:r>
+      <w:r>
+        <w:t xml:space="preserve"> </w:t>
+      </w:r>
+      <w:r>
+        <w:rPr>
+          <w:rStyle w:val="VerbatimChar"/>
+        </w:rPr>
+        <w:t xml:space="preserve">muto-3</w:t>
+      </w:r>
+      <w:r>
+        <w:t xml:space="preserve"> </w:t>
+      </w:r>
+      <w:r>
+        <w:t xml:space="preserve">currently runs on</w:t>
+      </w:r>
+      <w:r>
+        <w:t xml:space="preserve"> </w:t>
+      </w:r>
+      <w:r>
+        <w:rPr>
+          <w:rStyle w:val="VerbatimChar"/>
+        </w:rPr>
+        <w:t xml:space="preserve">-old</w:t>
+      </w:r>
+      <w:r>
+        <w:t xml:space="preserve">, which has 11 images (</w:t>
+      </w:r>
+      <w:r>
+        <w:rPr>
+          <w:rStyle w:val="VerbatimChar"/>
+        </w:rPr>
+        <w:t xml:space="preserve">Frame_2147229992.png</w:t>
+      </w:r>
+      <w:r>
+        <w:t xml:space="preserve">,</w:t>
+      </w:r>
+      <w:r>
+        <w:t xml:space="preserve"> </w:t>
+      </w:r>
+      <w:r>
+        <w:rPr>
+          <w:rStyle w:val="VerbatimChar"/>
+        </w:rPr>
+        <w:t xml:space="preserve">Frame_2147229969.png</w:t>
+      </w:r>
+      <w:r>
+        <w:t xml:space="preserve">,</w:t>
+      </w:r>
+      <w:r>
+        <w:t xml:space="preserve"> </w:t>
+      </w:r>
+      <w:r>
+        <w:rPr>
+          <w:rStyle w:val="VerbatimChar"/>
+        </w:rPr>
+        <w:t xml:space="preserve">5_advantage.webp</w:t>
+      </w:r>
+      <w:r>
+        <w:t xml:space="preserve"> </w:t>
+      </w:r>
+      <w:r>
+        <w:t xml:space="preserve">…). The -3 product only has the 3 simple-page images. Copy</w:t>
+      </w:r>
+      <w:r>
+        <w:t xml:space="preserve"> </w:t>
+      </w:r>
+      <w:r>
+        <w:rPr>
+          <w:rStyle w:val="VerbatimChar"/>
+        </w:rPr>
+        <w:t xml:space="preserve">-old</w:t>
+      </w:r>
+      <w:r>
+        <w:t xml:space="preserve">’s media onto</w:t>
+      </w:r>
+      <w:r>
+        <w:t xml:space="preserve"> </w:t>
+      </w:r>
+      <w:r>
+        <w:rPr>
+          <w:bCs/>
+          <w:b/>
+        </w:rPr>
+        <w:t xml:space="preserve">NAD+ Cellular Complex 3</w:t>
+      </w:r>
+      <w:r>
+        <w:t xml:space="preserve"> </w:t>
+      </w:r>
+      <w:r>
+        <w:t xml:space="preserve">(or upload new ones), or -3 will show the wrong carousel after the switch.</w:t>
       </w:r>
     </w:p>
     <w:p>
@@ -1368,17 +1783,23 @@
         <w:pStyle w:val="Compact"/>
       </w:pPr>
       <w:r>
-        <w:rPr>
-          <w:bCs/>
-          <w:b/>
-        </w:rPr>
-        <w:t xml:space="preserve">Bullets:</w:t>
-      </w:r>
-      <w:r>
-        <w:t xml:space="preserve"> </w:t>
-      </w:r>
-      <w:r>
-        <w:t xml:space="preserve">Energy that lasts through the afternoon / Bounce back from late nights, travel and workouts / Built for busy, stressful weeks / Feel the difference in 90 days, or your money back.</w:t>
+        <w:t xml:space="preserve">☐</w:t>
+      </w:r>
+      <w:r>
+        <w:t xml:space="preserve"> </w:t>
+      </w:r>
+      <w:r>
+        <w:rPr>
+          <w:bCs/>
+          <w:b/>
+        </w:rPr>
+        <w:t xml:space="preserve">-4 and -5:</w:t>
+      </w:r>
+      <w:r>
+        <w:t xml:space="preserve"> </w:t>
+      </w:r>
+      <w:r>
+        <w:t xml:space="preserve">no change; they keep their own media.</w:t>
       </w:r>
     </w:p>
     <w:p>
@@ -1390,180 +1811,101 @@
         <w:pStyle w:val="Compact"/>
       </w:pPr>
       <w:r>
-        <w:rPr>
-          <w:bCs/>
-          <w:b/>
-        </w:rPr>
-        <w:t xml:space="preserve">Problem:</w:t>
-      </w:r>
-      <w:r>
-        <w:t xml:space="preserve"> </w:t>
-      </w:r>
-      <w:r>
-        <w:t xml:space="preserve">“</w:t>
-      </w:r>
-      <w:r>
-        <w:t xml:space="preserve">Busy life. Same body. One energy budget.</w:t>
-      </w:r>
-      <w:r>
-        <w:t xml:space="preserve">”</w:t>
-      </w:r>
-      <w:r>
-        <w:t xml:space="preserve"> </w:t>
-      </w:r>
-      <w:r>
-        <w:t xml:space="preserve">with four cards: Sharp at 9am, gone by 4pm / One late night costs me two days / Always on, never off / A shelf full of pills.</w:t>
-      </w:r>
-    </w:p>
-    <w:p>
-      <w:pPr>
-        <w:numPr>
-          <w:ilvl w:val="0"/>
-          <w:numId w:val="1003"/>
-        </w:numPr>
-        <w:pStyle w:val="Compact"/>
-      </w:pPr>
-      <w:r>
-        <w:rPr>
-          <w:bCs/>
-          <w:b/>
-        </w:rPr>
-        <w:t xml:space="preserve">Benefits:</w:t>
-      </w:r>
-      <w:r>
-        <w:t xml:space="preserve"> </w:t>
-      </w:r>
-      <w:r>
-        <w:t xml:space="preserve">two tabs.</w:t>
-      </w:r>
-      <w:r>
-        <w:t xml:space="preserve"> </w:t>
-      </w:r>
-      <w:r>
-        <w:t xml:space="preserve">“</w:t>
-      </w:r>
-      <w:r>
-        <w:t xml:space="preserve">What you’ll feel</w:t>
-      </w:r>
-      <w:r>
-        <w:t xml:space="preserve">”</w:t>
-      </w:r>
-      <w:r>
-        <w:t xml:space="preserve"> </w:t>
-      </w:r>
-      <w:r>
-        <w:t xml:space="preserve">(energy past 4pm, bounce back faster, a steadier head in busy weeks, fewer flat days) and</w:t>
-      </w:r>
-      <w:r>
-        <w:t xml:space="preserve"> </w:t>
-      </w:r>
-      <w:r>
-        <w:t xml:space="preserve">“</w:t>
-      </w:r>
-      <w:r>
-        <w:t xml:space="preserve">Check it your way</w:t>
-      </w:r>
-      <w:r>
-        <w:t xml:space="preserve">”</w:t>
-      </w:r>
-      <w:r>
-        <w:t xml:space="preserve"> </w:t>
-      </w:r>
-      <w:r>
-        <w:t xml:space="preserve">(weekly check-in first, then HRV, resting heart rate, sleep, readiness or Body Battery).</w:t>
-      </w:r>
-    </w:p>
-    <w:p>
-      <w:pPr>
-        <w:numPr>
-          <w:ilvl w:val="0"/>
-          <w:numId w:val="1003"/>
-        </w:numPr>
-        <w:pStyle w:val="Compact"/>
-      </w:pPr>
-      <w:r>
-        <w:rPr>
-          <w:bCs/>
-          <w:b/>
-        </w:rPr>
-        <w:t xml:space="preserve">FAQ:</w:t>
-      </w:r>
-      <w:r>
-        <w:t xml:space="preserve"> </w:t>
-      </w:r>
-      <w:r>
-        <w:t xml:space="preserve">adds</w:t>
-      </w:r>
-      <w:r>
-        <w:t xml:space="preserve"> </w:t>
-      </w:r>
-      <w:r>
-        <w:t xml:space="preserve">“</w:t>
-      </w:r>
-      <w:r>
-        <w:t xml:space="preserve">Will it help with stress?</w:t>
-      </w:r>
-      <w:r>
-        <w:t xml:space="preserve">”</w:t>
-      </w:r>
-      <w:r>
-        <w:t xml:space="preserve"> </w:t>
-      </w:r>
-      <w:r>
-        <w:t xml:space="preserve">and</w:t>
-      </w:r>
-      <w:r>
-        <w:t xml:space="preserve"> </w:t>
-      </w:r>
-      <w:r>
-        <w:t xml:space="preserve">“</w:t>
-      </w:r>
-      <w:r>
-        <w:t xml:space="preserve">Is there caffeine in it?</w:t>
-      </w:r>
-      <w:r>
-        <w:t xml:space="preserve">”</w:t>
-      </w:r>
-      <w:r>
-        <w:t xml:space="preserve">.</w:t>
-      </w:r>
-    </w:p>
-    <w:p>
-      <w:pPr>
-        <w:numPr>
-          <w:ilvl w:val="0"/>
-          <w:numId w:val="1003"/>
-        </w:numPr>
-        <w:pStyle w:val="Compact"/>
-      </w:pPr>
-      <w:r>
-        <w:rPr>
-          <w:bCs/>
-          <w:b/>
-        </w:rPr>
-        <w:t xml:space="preserve">Same as today:</w:t>
-      </w:r>
-      <w:r>
-        <w:t xml:space="preserve"> </w:t>
-      </w:r>
-      <w:r>
-        <w:t xml:space="preserve">plans, gifts, gallery, comparison table, guarantee, reviews and sticky bar. Section order is unchanged.</w:t>
+        <w:t xml:space="preserve">☐</w:t>
+      </w:r>
+      <w:r>
+        <w:t xml:space="preserve"> </w:t>
+      </w:r>
+      <w:r>
+        <w:rPr>
+          <w:bCs/>
+          <w:b/>
+        </w:rPr>
+        <w:t xml:space="preserve">Main:</w:t>
+      </w:r>
+      <w:r>
+        <w:t xml:space="preserve"> </w:t>
+      </w:r>
+      <w:r>
+        <w:t xml:space="preserve">no change; it keeps its current 8 images (</w:t>
+      </w:r>
+      <w:r>
+        <w:rPr>
+          <w:rStyle w:val="VerbatimChar"/>
+        </w:rPr>
+        <w:t xml:space="preserve">new_garmin.png</w:t>
+      </w:r>
+      <w:r>
+        <w:t xml:space="preserve"> </w:t>
+      </w:r>
+      <w:r>
+        <w:t xml:space="preserve">first).</w:t>
+      </w:r>
+    </w:p>
+    <w:p>
+      <w:pPr>
+        <w:pStyle w:val="FirstParagraph"/>
+      </w:pPr>
+      <w:r>
+        <w:rPr>
+          <w:bCs/>
+          <w:b/>
+        </w:rPr>
+        <w:t xml:space="preserve">Don’t use Files → Replace on a shared image.</w:t>
+      </w:r>
+      <w:r>
+        <w:t xml:space="preserve"> </w:t>
+      </w:r>
+      <w:r>
+        <w:t xml:space="preserve">Several products use the same image files (for example</w:t>
+      </w:r>
+      <w:r>
+        <w:t xml:space="preserve"> </w:t>
+      </w:r>
+      <w:r>
+        <w:rPr>
+          <w:rStyle w:val="VerbatimChar"/>
+        </w:rPr>
+        <w:t xml:space="preserve">Frame_2147230136.png</w:t>
+      </w:r>
+      <w:r>
+        <w:t xml:space="preserve"> </w:t>
+      </w:r>
+      <w:r>
+        <w:t xml:space="preserve">is on main, -2 and -3). Replacing a file in Content → Files changes it on every product that uses it. To change one page, add, remove or reorder images in that product’s Media instead.</w:t>
+      </w:r>
+    </w:p>
+    <w:p>
+      <w:pPr>
+        <w:pStyle w:val="BodyText"/>
+      </w:pPr>
+      <w:r>
+        <w:t xml:space="preserve">If a product has no images at all, the main and -2 pages fall back to the gallery image blocks in the template.</w:t>
       </w:r>
     </w:p>
     <w:bookmarkEnd w:id="26"/>
-    <w:bookmarkStart w:id="27" w:name="page-4555-muto-nad-45"/>
+    <w:bookmarkStart w:id="29" w:name="whats-on-each-page"/>
+    <w:p>
+      <w:pPr>
+        <w:pStyle w:val="Heading1"/>
+      </w:pPr>
+      <w:r>
+        <w:t xml:space="preserve">What’s on each page</w:t>
+      </w:r>
+    </w:p>
+    <w:bookmarkStart w:id="27" w:name="main-page-muto-nad-performance"/>
     <w:p>
       <w:pPr>
         <w:pStyle w:val="Heading2"/>
       </w:pPr>
       <w:r>
-        <w:t xml:space="preserve">-2 page, 45–55 (</w:t>
-      </w:r>
-      <w:r>
-        <w:rPr>
-          <w:rStyle w:val="VerbatimChar"/>
-        </w:rPr>
-        <w:t xml:space="preserve">muto-nad-45</w:t>
+        <w:t xml:space="preserve">Main page (</w:t>
+      </w:r>
+      <w:r>
+        <w:rPr>
+          <w:rStyle w:val="VerbatimChar"/>
+        </w:rPr>
+        <w:t xml:space="preserve">muto-nad-performance</w:t>
       </w:r>
       <w:r>
         <w:t xml:space="preserve">)</w:t>
@@ -1591,7 +1933,7 @@
         <w:t xml:space="preserve">“</w:t>
       </w:r>
       <w:r>
-        <w:t xml:space="preserve">You’re not ready to slow down. You just want to feel like yourself again, with energy for the whole day, not just the morning. Two capsules with breakfast. Give it 90 days. Love it, or get your money back.</w:t>
+        <w:t xml:space="preserve">You’re doing more than ever. MUTO lets you see if it’s working. NR, which your body turns into NAD+, plus 18 supporting ingredients, every dose on the label. Two capsules with breakfast, then track your energy, recovery and stress on your wearable. 90 days to judge it, or your money back on subscriptions.</w:t>
       </w:r>
       <w:r>
         <w:t xml:space="preserve">”</w:t>
@@ -1610,13 +1952,25 @@
           <w:bCs/>
           <w:b/>
         </w:rPr>
-        <w:t xml:space="preserve">Bullets:</w:t>
-      </w:r>
-      <w:r>
-        <w:t xml:space="preserve"> </w:t>
-      </w:r>
-      <w:r>
-        <w:t xml:space="preserve">Feel like yourself again / Energy that lasts past lunch / Bounce back after a walk, a round or the gym / 90 days to try it, or your money back.</w:t>
+        <w:t xml:space="preserve">Banner:</w:t>
+      </w:r>
+      <w:r>
+        <w:t xml:space="preserve"> </w:t>
+      </w:r>
+      <w:r>
+        <w:t xml:space="preserve">“</w:t>
+      </w:r>
+      <w:r>
+        <w:t xml:space="preserve">Welcome kit worth £62, free with your first order</w:t>
+      </w:r>
+      <w:r>
+        <w:t xml:space="preserve">”</w:t>
+      </w:r>
+      <w:r>
+        <w:t xml:space="preserve"> </w:t>
+      </w:r>
+      <w:r>
+        <w:t xml:space="preserve">(as on your live creatine-kit page).</w:t>
       </w:r>
     </w:p>
     <w:p>
@@ -1632,25 +1986,13 @@
           <w:bCs/>
           <w:b/>
         </w:rPr>
-        <w:t xml:space="preserve">Problem:</w:t>
-      </w:r>
-      <w:r>
-        <w:t xml:space="preserve"> </w:t>
-      </w:r>
-      <w:r>
-        <w:t xml:space="preserve">“</w:t>
-      </w:r>
-      <w:r>
-        <w:t xml:space="preserve">You don’t feel old. So why so tired?</w:t>
-      </w:r>
-      <w:r>
-        <w:t xml:space="preserve">”</w:t>
-      </w:r>
-      <w:r>
-        <w:t xml:space="preserve"> </w:t>
-      </w:r>
-      <w:r>
-        <w:t xml:space="preserve">Cards: I used to have so much energy / My body takes longer to recover / I just want to feel like me again / Too many pills.</w:t>
+        <w:t xml:space="preserve">Bullets:</w:t>
+      </w:r>
+      <w:r>
+        <w:t xml:space="preserve"> </w:t>
+      </w:r>
+      <w:r>
+        <w:t xml:space="preserve">Energy that lasts through the afternoon / Bounce back from late nights, travel and workouts / Built for busy, stressful weeks / Feel the difference in 90 days, or your money back.</w:t>
       </w:r>
     </w:p>
     <w:p>
@@ -1666,13 +2008,7 @@
           <w:bCs/>
           <w:b/>
         </w:rPr>
-        <w:t xml:space="preserve">Simpler order:</w:t>
-      </w:r>
-      <w:r>
-        <w:t xml:space="preserve"> </w:t>
-      </w:r>
-      <w:r>
-        <w:t xml:space="preserve">buy → problem → what people notice → real stories → 90 days → guarantee → why trust us → experts → comparison → FAQs → reviews. The</w:t>
+        <w:t xml:space="preserve">Problem:</w:t>
       </w:r>
       <w:r>
         <w:t xml:space="preserve"> </w:t>
@@ -1681,7 +2017,7 @@
         <w:t xml:space="preserve">“</w:t>
       </w:r>
       <w:r>
-        <w:t xml:space="preserve">Two capsules</w:t>
+        <w:t xml:space="preserve">Busy life. Same body. One energy budget.</w:t>
       </w:r>
       <w:r>
         <w:t xml:space="preserve">”</w:t>
@@ -1690,25 +2026,7 @@
         <w:t xml:space="preserve"> </w:t>
       </w:r>
       <w:r>
-        <w:t xml:space="preserve">section and the full ingredients list are removed (the</w:t>
-      </w:r>
-      <w:r>
-        <w:t xml:space="preserve"> </w:t>
-      </w:r>
-      <w:r>
-        <w:t xml:space="preserve">“</w:t>
-      </w:r>
-      <w:r>
-        <w:t xml:space="preserve">What’s inside</w:t>
-      </w:r>
-      <w:r>
-        <w:t xml:space="preserve">”</w:t>
-      </w:r>
-      <w:r>
-        <w:t xml:space="preserve"> </w:t>
-      </w:r>
-      <w:r>
-        <w:t xml:space="preserve">fold in the buy box still covers ingredients). Benefits has one view only; the tracking tab is folded into the 90-day steps.</w:t>
+        <w:t xml:space="preserve">with four cards: Sharp at 9am, gone by 4pm / One late night costs me two days / Always on, never off / A shelf full of pills.</w:t>
       </w:r>
     </w:p>
     <w:p>
@@ -1724,13 +2042,13 @@
           <w:bCs/>
           <w:b/>
         </w:rPr>
-        <w:t xml:space="preserve">FAQ:</w:t>
-      </w:r>
-      <w:r>
-        <w:t xml:space="preserve"> </w:t>
-      </w:r>
-      <w:r>
-        <w:t xml:space="preserve">adds</w:t>
+        <w:t xml:space="preserve">Benefits:</w:t>
+      </w:r>
+      <w:r>
+        <w:t xml:space="preserve"> </w:t>
+      </w:r>
+      <w:r>
+        <w:t xml:space="preserve">two tabs.</w:t>
       </w:r>
       <w:r>
         <w:t xml:space="preserve"> </w:t>
@@ -1739,7 +2057,7 @@
         <w:t xml:space="preserve">“</w:t>
       </w:r>
       <w:r>
-        <w:t xml:space="preserve">Is it right for my age?</w:t>
+        <w:t xml:space="preserve">What you’ll feel</w:t>
       </w:r>
       <w:r>
         <w:t xml:space="preserve">”</w:t>
@@ -1748,7 +2066,25 @@
         <w:t xml:space="preserve"> </w:t>
       </w:r>
       <w:r>
-        <w:t xml:space="preserve">first.</w:t>
+        <w:t xml:space="preserve">(energy past 4pm, bounce back faster, a steadier head in busy weeks, fewer flat days) and</w:t>
+      </w:r>
+      <w:r>
+        <w:t xml:space="preserve"> </w:t>
+      </w:r>
+      <w:r>
+        <w:t xml:space="preserve">“</w:t>
+      </w:r>
+      <w:r>
+        <w:t xml:space="preserve">Check it your way</w:t>
+      </w:r>
+      <w:r>
+        <w:t xml:space="preserve">”</w:t>
+      </w:r>
+      <w:r>
+        <w:t xml:space="preserve"> </w:t>
+      </w:r>
+      <w:r>
+        <w:t xml:space="preserve">(weekly check-in first, then HRV, resting heart rate, sleep, readiness or Body Battery).</w:t>
       </w:r>
     </w:p>
     <w:p>
@@ -1764,131 +2100,409 @@
           <w:bCs/>
           <w:b/>
         </w:rPr>
-        <w:t xml:space="preserve">Easier reading:</w:t>
-      </w:r>
-      <w:r>
-        <w:t xml:space="preserve"> </w:t>
-      </w:r>
-      <w:r>
-        <w:t xml:space="preserve">a</w:t>
-      </w:r>
-      <w:r>
-        <w:t xml:space="preserve"> </w:t>
-      </w:r>
-      <w:r>
-        <w:rPr>
-          <w:rStyle w:val="VerbatimChar"/>
-        </w:rPr>
-        <w:t xml:space="preserve">custom-liquid</w:t>
-      </w:r>
-      <w:r>
-        <w:t xml:space="preserve"> </w:t>
-      </w:r>
-      <w:r>
-        <w:t xml:space="preserve">section at the end of the template (</w:t>
-      </w:r>
-      <w:r>
-        <w:rPr>
-          <w:rStyle w:val="VerbatimChar"/>
-        </w:rPr>
-        <w:t xml:space="preserve">easy_read</w:t>
-      </w:r>
-      <w:r>
-        <w:t xml:space="preserve">, zero padding) holds a</w:t>
-      </w:r>
-      <w:r>
-        <w:t xml:space="preserve"> </w:t>
-      </w:r>
-      <w:r>
-        <w:rPr>
-          <w:rStyle w:val="VerbatimChar"/>
-        </w:rPr>
-        <w:t xml:space="preserve">&lt;style&gt;</w:t>
-      </w:r>
-      <w:r>
-        <w:t xml:space="preserve"> </w:t>
-      </w:r>
-      <w:r>
-        <w:t xml:space="preserve">block. It only exists in this template, so no other page is affected. It:</w:t>
+        <w:t xml:space="preserve">FAQ:</w:t>
+      </w:r>
+      <w:r>
+        <w:t xml:space="preserve"> </w:t>
+      </w:r>
+      <w:r>
+        <w:t xml:space="preserve">adds</w:t>
+      </w:r>
+      <w:r>
+        <w:t xml:space="preserve"> </w:t>
+      </w:r>
+      <w:r>
+        <w:t xml:space="preserve">“</w:t>
+      </w:r>
+      <w:r>
+        <w:t xml:space="preserve">Will it help with stress?</w:t>
+      </w:r>
+      <w:r>
+        <w:t xml:space="preserve">”</w:t>
+      </w:r>
+      <w:r>
+        <w:t xml:space="preserve"> </w:t>
+      </w:r>
+      <w:r>
+        <w:t xml:space="preserve">and</w:t>
+      </w:r>
+      <w:r>
+        <w:t xml:space="preserve"> </w:t>
+      </w:r>
+      <w:r>
+        <w:t xml:space="preserve">“</w:t>
+      </w:r>
+      <w:r>
+        <w:t xml:space="preserve">Is there caffeine in it?</w:t>
+      </w:r>
+      <w:r>
+        <w:t xml:space="preserve">”</w:t>
+      </w:r>
+      <w:r>
+        <w:t xml:space="preserve">.</w:t>
       </w:r>
     </w:p>
     <w:p>
       <w:pPr>
         <w:numPr>
-          <w:ilvl w:val="1"/>
+          <w:ilvl w:val="0"/>
+          <w:numId w:val="1004"/>
+        </w:numPr>
+        <w:pStyle w:val="Compact"/>
+      </w:pPr>
+      <w:r>
+        <w:rPr>
+          <w:bCs/>
+          <w:b/>
+        </w:rPr>
+        <w:t xml:space="preserve">Same as today:</w:t>
+      </w:r>
+      <w:r>
+        <w:t xml:space="preserve"> </w:t>
+      </w:r>
+      <w:r>
+        <w:t xml:space="preserve">plans, gifts, gallery, comparison table, guarantee, reviews and sticky bar. Section order is unchanged.</w:t>
+      </w:r>
+    </w:p>
+    <w:bookmarkEnd w:id="27"/>
+    <w:bookmarkStart w:id="28" w:name="page-4555-muto-nad-45"/>
+    <w:p>
+      <w:pPr>
+        <w:pStyle w:val="Heading2"/>
+      </w:pPr>
+      <w:r>
+        <w:t xml:space="preserve">-2 page, 45–55 (</w:t>
+      </w:r>
+      <w:r>
+        <w:rPr>
+          <w:rStyle w:val="VerbatimChar"/>
+        </w:rPr>
+        <w:t xml:space="preserve">muto-nad-45</w:t>
+      </w:r>
+      <w:r>
+        <w:t xml:space="preserve">)</w:t>
+      </w:r>
+    </w:p>
+    <w:p>
+      <w:pPr>
+        <w:numPr>
+          <w:ilvl w:val="0"/>
           <w:numId w:val="1005"/>
         </w:numPr>
         <w:pStyle w:val="Compact"/>
       </w:pPr>
       <w:r>
-        <w:t xml:space="preserve">raises body text from 16px to 17px, with a looser line height;</w:t>
+        <w:rPr>
+          <w:bCs/>
+          <w:b/>
+        </w:rPr>
+        <w:t xml:space="preserve">Buy box intro:</w:t>
+      </w:r>
+      <w:r>
+        <w:t xml:space="preserve"> </w:t>
+      </w:r>
+      <w:r>
+        <w:t xml:space="preserve">“</w:t>
+      </w:r>
+      <w:r>
+        <w:t xml:space="preserve">You’re not ready to slow down. You just want to feel like yourself again, with energy for the whole day, not just the morning. Two capsules with breakfast. Give it 90 days. Love it, or get your money back.</w:t>
+      </w:r>
+      <w:r>
+        <w:t xml:space="preserve">”</w:t>
       </w:r>
     </w:p>
     <w:p>
       <w:pPr>
         <w:numPr>
-          <w:ilvl w:val="1"/>
+          <w:ilvl w:val="0"/>
           <w:numId w:val="1005"/>
         </w:numPr>
         <w:pStyle w:val="Compact"/>
       </w:pPr>
       <w:r>
-        <w:t xml:space="preserve">sets the opening line to 19px, the problem intro to 20px and step titles to 23px;</w:t>
+        <w:rPr>
+          <w:bCs/>
+          <w:b/>
+        </w:rPr>
+        <w:t xml:space="preserve">Bullets:</w:t>
+      </w:r>
+      <w:r>
+        <w:t xml:space="preserve"> </w:t>
+      </w:r>
+      <w:r>
+        <w:t xml:space="preserve">Feel like yourself again / Energy that lasts past lunch / Bounce back after a walk, a round or the gym / 90 days to try it, or your money back.</w:t>
       </w:r>
     </w:p>
     <w:p>
       <w:pPr>
         <w:numPr>
-          <w:ilvl w:val="1"/>
+          <w:ilvl w:val="0"/>
           <w:numId w:val="1005"/>
         </w:numPr>
         <w:pStyle w:val="Compact"/>
       </w:pPr>
       <w:r>
-        <w:t xml:space="preserve">darkens grey secondary text;</w:t>
+        <w:rPr>
+          <w:bCs/>
+          <w:b/>
+        </w:rPr>
+        <w:t xml:space="preserve">Problem:</w:t>
+      </w:r>
+      <w:r>
+        <w:t xml:space="preserve"> </w:t>
+      </w:r>
+      <w:r>
+        <w:t xml:space="preserve">“</w:t>
+      </w:r>
+      <w:r>
+        <w:t xml:space="preserve">You don’t feel old. So why so tired?</w:t>
+      </w:r>
+      <w:r>
+        <w:t xml:space="preserve">”</w:t>
+      </w:r>
+      <w:r>
+        <w:t xml:space="preserve"> </w:t>
+      </w:r>
+      <w:r>
+        <w:t xml:space="preserve">Cards: I used to have so much energy / My body takes longer to recover / I just want to feel like me again / Too many pills.</w:t>
       </w:r>
     </w:p>
     <w:p>
       <w:pPr>
         <w:numPr>
-          <w:ilvl w:val="1"/>
+          <w:ilvl w:val="0"/>
           <w:numId w:val="1005"/>
         </w:numPr>
         <w:pStyle w:val="Compact"/>
       </w:pPr>
       <w:r>
-        <w:t xml:space="preserve">enlarges the gift labels from 10px to 13px and the plan prices to 20px;</w:t>
+        <w:rPr>
+          <w:bCs/>
+          <w:b/>
+        </w:rPr>
+        <w:t xml:space="preserve">Simpler order:</w:t>
+      </w:r>
+      <w:r>
+        <w:t xml:space="preserve"> </w:t>
+      </w:r>
+      <w:r>
+        <w:t xml:space="preserve">buy → problem → what people notice → real stories → 90 days → guarantee → why trust us → experts → comparison → FAQs → reviews. The</w:t>
+      </w:r>
+      <w:r>
+        <w:t xml:space="preserve"> </w:t>
+      </w:r>
+      <w:r>
+        <w:t xml:space="preserve">“</w:t>
+      </w:r>
+      <w:r>
+        <w:t xml:space="preserve">Two capsules</w:t>
+      </w:r>
+      <w:r>
+        <w:t xml:space="preserve">”</w:t>
+      </w:r>
+      <w:r>
+        <w:t xml:space="preserve"> </w:t>
+      </w:r>
+      <w:r>
+        <w:t xml:space="preserve">section and the full ingredients list are removed (the</w:t>
+      </w:r>
+      <w:r>
+        <w:t xml:space="preserve"> </w:t>
+      </w:r>
+      <w:r>
+        <w:t xml:space="preserve">“</w:t>
+      </w:r>
+      <w:r>
+        <w:t xml:space="preserve">What’s inside</w:t>
+      </w:r>
+      <w:r>
+        <w:t xml:space="preserve">”</w:t>
+      </w:r>
+      <w:r>
+        <w:t xml:space="preserve"> </w:t>
+      </w:r>
+      <w:r>
+        <w:t xml:space="preserve">fold in the buy box still covers ingredients). Benefits has one view only; the tracking tab is folded into the 90-day steps.</w:t>
       </w:r>
     </w:p>
     <w:p>
       <w:pPr>
         <w:numPr>
-          <w:ilvl w:val="1"/>
+          <w:ilvl w:val="0"/>
           <w:numId w:val="1005"/>
         </w:numPr>
         <w:pStyle w:val="Compact"/>
       </w:pPr>
       <w:r>
-        <w:t xml:space="preserve">makes the buttons 17px and 56px tall;</w:t>
+        <w:rPr>
+          <w:bCs/>
+          <w:b/>
+        </w:rPr>
+        <w:t xml:space="preserve">FAQ:</w:t>
+      </w:r>
+      <w:r>
+        <w:t xml:space="preserve"> </w:t>
+      </w:r>
+      <w:r>
+        <w:t xml:space="preserve">adds</w:t>
+      </w:r>
+      <w:r>
+        <w:t xml:space="preserve"> </w:t>
+      </w:r>
+      <w:r>
+        <w:t xml:space="preserve">“</w:t>
+      </w:r>
+      <w:r>
+        <w:t xml:space="preserve">Is it right for my age?</w:t>
+      </w:r>
+      <w:r>
+        <w:t xml:space="preserve">”</w:t>
+      </w:r>
+      <w:r>
+        <w:t xml:space="preserve"> </w:t>
+      </w:r>
+      <w:r>
+        <w:t xml:space="preserve">first.</w:t>
       </w:r>
     </w:p>
     <w:p>
       <w:pPr>
         <w:numPr>
-          <w:ilvl w:val="1"/>
+          <w:ilvl w:val="0"/>
           <w:numId w:val="1005"/>
         </w:numPr>
         <w:pStyle w:val="Compact"/>
       </w:pPr>
       <w:r>
-        <w:t xml:space="preserve">keeps the trust pills at theme size, on one line on desktop;</w:t>
+        <w:rPr>
+          <w:bCs/>
+          <w:b/>
+        </w:rPr>
+        <w:t xml:space="preserve">Easier reading:</w:t>
+      </w:r>
+      <w:r>
+        <w:t xml:space="preserve"> </w:t>
+      </w:r>
+      <w:r>
+        <w:t xml:space="preserve">a</w:t>
+      </w:r>
+      <w:r>
+        <w:t xml:space="preserve"> </w:t>
+      </w:r>
+      <w:r>
+        <w:rPr>
+          <w:rStyle w:val="VerbatimChar"/>
+        </w:rPr>
+        <w:t xml:space="preserve">custom-liquid</w:t>
+      </w:r>
+      <w:r>
+        <w:t xml:space="preserve"> </w:t>
+      </w:r>
+      <w:r>
+        <w:t xml:space="preserve">section at the end of the template (</w:t>
+      </w:r>
+      <w:r>
+        <w:rPr>
+          <w:rStyle w:val="VerbatimChar"/>
+        </w:rPr>
+        <w:t xml:space="preserve">easy_read</w:t>
+      </w:r>
+      <w:r>
+        <w:t xml:space="preserve">, zero padding) holds a</w:t>
+      </w:r>
+      <w:r>
+        <w:t xml:space="preserve"> </w:t>
+      </w:r>
+      <w:r>
+        <w:rPr>
+          <w:rStyle w:val="VerbatimChar"/>
+        </w:rPr>
+        <w:t xml:space="preserve">&lt;style&gt;</w:t>
+      </w:r>
+      <w:r>
+        <w:t xml:space="preserve"> </w:t>
+      </w:r>
+      <w:r>
+        <w:t xml:space="preserve">block. It only exists in this template, so no other page is affected. It:</w:t>
       </w:r>
     </w:p>
     <w:p>
       <w:pPr>
         <w:numPr>
           <w:ilvl w:val="1"/>
-          <w:numId w:val="1005"/>
+          <w:numId w:val="1006"/>
+        </w:numPr>
+        <w:pStyle w:val="Compact"/>
+      </w:pPr>
+      <w:r>
+        <w:t xml:space="preserve">raises body text from 16px to 17px, with a looser line height;</w:t>
+      </w:r>
+    </w:p>
+    <w:p>
+      <w:pPr>
+        <w:numPr>
+          <w:ilvl w:val="1"/>
+          <w:numId w:val="1006"/>
+        </w:numPr>
+        <w:pStyle w:val="Compact"/>
+      </w:pPr>
+      <w:r>
+        <w:t xml:space="preserve">sets the opening line to 19px, the problem intro to 20px and step titles to 23px;</w:t>
+      </w:r>
+    </w:p>
+    <w:p>
+      <w:pPr>
+        <w:numPr>
+          <w:ilvl w:val="1"/>
+          <w:numId w:val="1006"/>
+        </w:numPr>
+        <w:pStyle w:val="Compact"/>
+      </w:pPr>
+      <w:r>
+        <w:t xml:space="preserve">darkens grey secondary text;</w:t>
+      </w:r>
+    </w:p>
+    <w:p>
+      <w:pPr>
+        <w:numPr>
+          <w:ilvl w:val="1"/>
+          <w:numId w:val="1006"/>
+        </w:numPr>
+        <w:pStyle w:val="Compact"/>
+      </w:pPr>
+      <w:r>
+        <w:t xml:space="preserve">enlarges the gift labels from 10px to 13px and the plan prices to 20px;</w:t>
+      </w:r>
+    </w:p>
+    <w:p>
+      <w:pPr>
+        <w:numPr>
+          <w:ilvl w:val="1"/>
+          <w:numId w:val="1006"/>
+        </w:numPr>
+        <w:pStyle w:val="Compact"/>
+      </w:pPr>
+      <w:r>
+        <w:t xml:space="preserve">makes the buttons 17px and 56px tall;</w:t>
+      </w:r>
+    </w:p>
+    <w:p>
+      <w:pPr>
+        <w:numPr>
+          <w:ilvl w:val="1"/>
+          <w:numId w:val="1006"/>
+        </w:numPr>
+        <w:pStyle w:val="Compact"/>
+      </w:pPr>
+      <w:r>
+        <w:t xml:space="preserve">keeps the trust pills at theme size, on one line on desktop;</w:t>
+      </w:r>
+    </w:p>
+    <w:p>
+      <w:pPr>
+        <w:numPr>
+          <w:ilvl w:val="1"/>
+          <w:numId w:val="1006"/>
         </w:numPr>
         <w:pStyle w:val="Compact"/>
       </w:pPr>
@@ -1923,302 +2537,15 @@
         <w:t xml:space="preserve">if you’d rather move it into a stylesheet later.</w:t>
       </w:r>
     </w:p>
-    <w:bookmarkEnd w:id="27"/>
     <w:bookmarkEnd w:id="28"/>
-    <w:bookmarkStart w:id="29" w:name="notes"/>
+    <w:bookmarkEnd w:id="29"/>
+    <w:bookmarkStart w:id="30" w:name="notes"/>
     <w:p>
       <w:pPr>
         <w:pStyle w:val="Heading1"/>
       </w:pPr>
       <w:r>
         <w:t xml:space="preserve">Notes</w:t>
-      </w:r>
-    </w:p>
-    <w:p>
-      <w:pPr>
-        <w:numPr>
-          <w:ilvl w:val="0"/>
-          <w:numId w:val="1006"/>
-        </w:numPr>
-        <w:pStyle w:val="Compact"/>
-      </w:pPr>
-      <w:r>
-        <w:t xml:space="preserve">☐</w:t>
-      </w:r>
-      <w:r>
-        <w:t xml:space="preserve"> </w:t>
-      </w:r>
-      <w:r>
-        <w:rPr>
-          <w:bCs/>
-          <w:b/>
-        </w:rPr>
-        <w:t xml:space="preserve">Product titles in cart and checkout:</w:t>
-      </w:r>
-      <w:r>
-        <w:t xml:space="preserve"> </w:t>
-      </w:r>
-      <w:r>
-        <w:t xml:space="preserve">the -2 and -3 products are titled</w:t>
-      </w:r>
-      <w:r>
-        <w:t xml:space="preserve"> </w:t>
-      </w:r>
-      <w:r>
-        <w:t xml:space="preserve">“</w:t>
-      </w:r>
-      <w:r>
-        <w:t xml:space="preserve">NAD+ Cellular Complex 2</w:t>
-      </w:r>
-      <w:r>
-        <w:t xml:space="preserve">”</w:t>
-      </w:r>
-      <w:r>
-        <w:t xml:space="preserve"> </w:t>
-      </w:r>
-      <w:r>
-        <w:t xml:space="preserve">and</w:t>
-      </w:r>
-      <w:r>
-        <w:t xml:space="preserve"> </w:t>
-      </w:r>
-      <w:r>
-        <w:t xml:space="preserve">“</w:t>
-      </w:r>
-      <w:r>
-        <w:t xml:space="preserve">NAD+ Cellular Complex 3</w:t>
-      </w:r>
-      <w:r>
-        <w:t xml:space="preserve">”</w:t>
-      </w:r>
-      <w:r>
-        <w:t xml:space="preserve">, and that title shows in the cart, checkout and order emails. Worth renaming both to</w:t>
-      </w:r>
-      <w:r>
-        <w:t xml:space="preserve"> </w:t>
-      </w:r>
-      <w:r>
-        <w:t xml:space="preserve">“</w:t>
-      </w:r>
-      <w:r>
-        <w:t xml:space="preserve">NAD+ Cellular Complex</w:t>
-      </w:r>
-      <w:r>
-        <w:t xml:space="preserve">”</w:t>
-      </w:r>
-      <w:r>
-        <w:t xml:space="preserve"> </w:t>
-      </w:r>
-      <w:r>
-        <w:t xml:space="preserve">if these pages get traffic.</w:t>
-      </w:r>
-    </w:p>
-    <w:p>
-      <w:pPr>
-        <w:numPr>
-          <w:ilvl w:val="0"/>
-          <w:numId w:val="1006"/>
-        </w:numPr>
-        <w:pStyle w:val="Compact"/>
-      </w:pPr>
-      <w:r>
-        <w:t xml:space="preserve">☐</w:t>
-      </w:r>
-      <w:r>
-        <w:t xml:space="preserve"> </w:t>
-      </w:r>
-      <w:r>
-        <w:rPr>
-          <w:bCs/>
-          <w:b/>
-        </w:rPr>
-        <w:t xml:space="preserve">Hidden 3-month plan:</w:t>
-      </w:r>
-      <w:r>
-        <w:t xml:space="preserve"> </w:t>
-      </w:r>
-      <w:r>
-        <w:t xml:space="preserve">both new templates keep your</w:t>
-      </w:r>
-      <w:r>
-        <w:t xml:space="preserve"> </w:t>
-      </w:r>
-      <w:r>
-        <w:rPr>
-          <w:rStyle w:val="VerbatimChar"/>
-        </w:rPr>
-        <w:t xml:space="preserve">hidden_plans</w:t>
-      </w:r>
-      <w:r>
-        <w:t xml:space="preserve"> </w:t>
-      </w:r>
-      <w:r>
-        <w:t xml:space="preserve">setting, so only the monthly plan shows. If the 3-month plan should show on the 45–55 page, clear</w:t>
-      </w:r>
-      <w:r>
-        <w:t xml:space="preserve"> </w:t>
-      </w:r>
-      <w:r>
-        <w:rPr>
-          <w:rStyle w:val="VerbatimChar"/>
-        </w:rPr>
-        <w:t xml:space="preserve">hidden_plans</w:t>
-      </w:r>
-      <w:r>
-        <w:t xml:space="preserve"> </w:t>
-      </w:r>
-      <w:r>
-        <w:t xml:space="preserve">on it.</w:t>
-      </w:r>
-    </w:p>
-    <w:p>
-      <w:pPr>
-        <w:numPr>
-          <w:ilvl w:val="0"/>
-          <w:numId w:val="1006"/>
-        </w:numPr>
-        <w:pStyle w:val="Compact"/>
-      </w:pPr>
-      <w:r>
-        <w:t xml:space="preserve">☐</w:t>
-      </w:r>
-      <w:r>
-        <w:t xml:space="preserve"> </w:t>
-      </w:r>
-      <w:r>
-        <w:rPr>
-          <w:rStyle w:val="VerbatimChar"/>
-          <w:bCs/>
-          <w:b/>
-        </w:rPr>
-        <w:t xml:space="preserve">-old</w:t>
-      </w:r>
-      <w:r>
-        <w:rPr>
-          <w:bCs/>
-          <w:b/>
-        </w:rPr>
-        <w:t xml:space="preserve"> </w:t>
-      </w:r>
-      <w:r>
-        <w:rPr>
-          <w:bCs/>
-          <w:b/>
-        </w:rPr>
-        <w:t xml:space="preserve">product:</w:t>
-      </w:r>
-      <w:r>
-        <w:t xml:space="preserve"> </w:t>
-      </w:r>
-      <w:r>
-        <w:t xml:space="preserve">after the switch,</w:t>
-      </w:r>
-      <w:r>
-        <w:t xml:space="preserve"> </w:t>
-      </w:r>
-      <w:r>
-        <w:rPr>
-          <w:rStyle w:val="VerbatimChar"/>
-        </w:rPr>
-        <w:t xml:space="preserve">muto-3</w:t>
-      </w:r>
-      <w:r>
-        <w:t xml:space="preserve"> </w:t>
-      </w:r>
-      <w:r>
-        <w:t xml:space="preserve">is on both</w:t>
-      </w:r>
-      <w:r>
-        <w:t xml:space="preserve"> </w:t>
-      </w:r>
-      <w:r>
-        <w:rPr>
-          <w:rStyle w:val="VerbatimChar"/>
-        </w:rPr>
-        <w:t xml:space="preserve">-old</w:t>
-      </w:r>
-      <w:r>
-        <w:t xml:space="preserve"> </w:t>
-      </w:r>
-      <w:r>
-        <w:t xml:space="preserve">and</w:t>
-      </w:r>
-      <w:r>
-        <w:t xml:space="preserve"> </w:t>
-      </w:r>
-      <w:r>
-        <w:rPr>
-          <w:rStyle w:val="VerbatimChar"/>
-        </w:rPr>
-        <w:t xml:space="preserve">-3</w:t>
-      </w:r>
-      <w:r>
-        <w:t xml:space="preserve">. Leave</w:t>
-      </w:r>
-      <w:r>
-        <w:t xml:space="preserve"> </w:t>
-      </w:r>
-      <w:r>
-        <w:rPr>
-          <w:rStyle w:val="VerbatimChar"/>
-        </w:rPr>
-        <w:t xml:space="preserve">-old</w:t>
-      </w:r>
-      <w:r>
-        <w:t xml:space="preserve"> </w:t>
-      </w:r>
-      <w:r>
-        <w:t xml:space="preserve">as it is, or redirect it to</w:t>
-      </w:r>
-      <w:r>
-        <w:t xml:space="preserve"> </w:t>
-      </w:r>
-      <w:r>
-        <w:rPr>
-          <w:rStyle w:val="VerbatimChar"/>
-        </w:rPr>
-        <w:t xml:space="preserve">-3</w:t>
-      </w:r>
-      <w:r>
-        <w:t xml:space="preserve">.</w:t>
-      </w:r>
-    </w:p>
-    <w:p>
-      <w:pPr>
-        <w:numPr>
-          <w:ilvl w:val="0"/>
-          <w:numId w:val="1006"/>
-        </w:numPr>
-        <w:pStyle w:val="Compact"/>
-      </w:pPr>
-      <w:r>
-        <w:t xml:space="preserve">☐</w:t>
-      </w:r>
-      <w:r>
-        <w:t xml:space="preserve"> </w:t>
-      </w:r>
-      <w:r>
-        <w:rPr>
-          <w:bCs/>
-          <w:b/>
-        </w:rPr>
-        <w:t xml:space="preserve">Ads and links:</w:t>
-      </w:r>
-      <w:r>
-        <w:t xml:space="preserve"> </w:t>
-      </w:r>
-      <w:r>
-        <w:t xml:space="preserve">anything pointing at the main page will show the new copy straight away. Any ad that should keep the old creatine-kit copy needs its own product and URL.</w:t>
-      </w:r>
-    </w:p>
-    <w:bookmarkEnd w:id="29"/>
-    <w:bookmarkStart w:id="30" w:name="check-after-publishing"/>
-    <w:p>
-      <w:pPr>
-        <w:pStyle w:val="Heading1"/>
-      </w:pPr>
-      <w:r>
-        <w:t xml:space="preserve">Check after publishing</w:t>
       </w:r>
     </w:p>
     <w:p>
@@ -2230,17 +2557,23 @@
         <w:pStyle w:val="Compact"/>
       </w:pPr>
       <w:r>
-        <w:rPr>
-          <w:bCs/>
-          <w:b/>
-        </w:rPr>
-        <w:t xml:space="preserve">Main page:</w:t>
-      </w:r>
-      <w:r>
-        <w:t xml:space="preserve"> </w:t>
-      </w:r>
-      <w:r>
-        <w:t xml:space="preserve">the intro starts</w:t>
+        <w:t xml:space="preserve">☐</w:t>
+      </w:r>
+      <w:r>
+        <w:t xml:space="preserve"> </w:t>
+      </w:r>
+      <w:r>
+        <w:rPr>
+          <w:bCs/>
+          <w:b/>
+        </w:rPr>
+        <w:t xml:space="preserve">Product titles in cart and checkout:</w:t>
+      </w:r>
+      <w:r>
+        <w:t xml:space="preserve"> </w:t>
+      </w:r>
+      <w:r>
+        <w:t xml:space="preserve">the -2 and -3 products are titled</w:t>
       </w:r>
       <w:r>
         <w:t xml:space="preserve"> </w:t>
@@ -2249,13 +2582,16 @@
         <w:t xml:space="preserve">“</w:t>
       </w:r>
       <w:r>
-        <w:t xml:space="preserve">You’re doing more than ever</w:t>
+        <w:t xml:space="preserve">NAD+ Cellular Complex 2</w:t>
       </w:r>
       <w:r>
         <w:t xml:space="preserve">”</w:t>
       </w:r>
       <w:r>
-        <w:t xml:space="preserve">, the banner says £62, only the monthly plan shows, and the benefits tabs read</w:t>
+        <w:t xml:space="preserve"> </w:t>
+      </w:r>
+      <w:r>
+        <w:t xml:space="preserve">and</w:t>
       </w:r>
       <w:r>
         <w:t xml:space="preserve"> </w:t>
@@ -2264,16 +2600,13 @@
         <w:t xml:space="preserve">“</w:t>
       </w:r>
       <w:r>
-        <w:t xml:space="preserve">What you’ll feel</w:t>
+        <w:t xml:space="preserve">NAD+ Cellular Complex 3</w:t>
       </w:r>
       <w:r>
         <w:t xml:space="preserve">”</w:t>
       </w:r>
       <w:r>
-        <w:t xml:space="preserve"> </w:t>
-      </w:r>
-      <w:r>
-        <w:t xml:space="preserve">and</w:t>
+        <w:t xml:space="preserve">, and that title shows in the cart, checkout and order emails. Worth renaming both to</w:t>
       </w:r>
       <w:r>
         <w:t xml:space="preserve"> </w:t>
@@ -2282,13 +2615,16 @@
         <w:t xml:space="preserve">“</w:t>
       </w:r>
       <w:r>
-        <w:t xml:space="preserve">Check it your way</w:t>
+        <w:t xml:space="preserve">NAD+ Cellular Complex</w:t>
       </w:r>
       <w:r>
         <w:t xml:space="preserve">”</w:t>
       </w:r>
       <w:r>
-        <w:t xml:space="preserve">.</w:t>
+        <w:t xml:space="preserve"> </w:t>
+      </w:r>
+      <w:r>
+        <w:t xml:space="preserve">if these pages get traffic.</w:t>
       </w:r>
     </w:p>
     <w:p>
@@ -2300,41 +2636,53 @@
         <w:pStyle w:val="Compact"/>
       </w:pPr>
       <w:r>
-        <w:rPr>
-          <w:bCs/>
-          <w:b/>
-        </w:rPr>
-        <w:t xml:space="preserve">-2:</w:t>
-      </w:r>
-      <w:r>
-        <w:t xml:space="preserve"> </w:t>
-      </w:r>
-      <w:r>
-        <w:t xml:space="preserve">“</w:t>
-      </w:r>
-      <w:r>
-        <w:t xml:space="preserve">You don’t feel old. So why so tired?</w:t>
-      </w:r>
-      <w:r>
-        <w:t xml:space="preserve">”</w:t>
-      </w:r>
-      <w:r>
-        <w:t xml:space="preserve"> </w:t>
-      </w:r>
-      <w:r>
-        <w:t xml:space="preserve">is the problem heading. The Garmin tile and the plain-English comparison table (</w:t>
-      </w:r>
-      <w:r>
-        <w:t xml:space="preserve">“</w:t>
-      </w:r>
-      <w:r>
-        <w:t xml:space="preserve">The easy way to get NAD⁺.</w:t>
-      </w:r>
-      <w:r>
-        <w:t xml:space="preserve">”</w:t>
-      </w:r>
-      <w:r>
-        <w:t xml:space="preserve">) show, the text is visibly larger, and the trust pills each sit on one line on desktop.</w:t>
+        <w:t xml:space="preserve">☐</w:t>
+      </w:r>
+      <w:r>
+        <w:t xml:space="preserve"> </w:t>
+      </w:r>
+      <w:r>
+        <w:rPr>
+          <w:bCs/>
+          <w:b/>
+        </w:rPr>
+        <w:t xml:space="preserve">Hidden 3-month plan:</w:t>
+      </w:r>
+      <w:r>
+        <w:t xml:space="preserve"> </w:t>
+      </w:r>
+      <w:r>
+        <w:t xml:space="preserve">both new templates keep your</w:t>
+      </w:r>
+      <w:r>
+        <w:t xml:space="preserve"> </w:t>
+      </w:r>
+      <w:r>
+        <w:rPr>
+          <w:rStyle w:val="VerbatimChar"/>
+        </w:rPr>
+        <w:t xml:space="preserve">hidden_plans</w:t>
+      </w:r>
+      <w:r>
+        <w:t xml:space="preserve"> </w:t>
+      </w:r>
+      <w:r>
+        <w:t xml:space="preserve">setting, so only the monthly plan shows. If the 3-month plan should show on the 45–55 page, clear</w:t>
+      </w:r>
+      <w:r>
+        <w:t xml:space="preserve"> </w:t>
+      </w:r>
+      <w:r>
+        <w:rPr>
+          <w:rStyle w:val="VerbatimChar"/>
+        </w:rPr>
+        <w:t xml:space="preserve">hidden_plans</w:t>
+      </w:r>
+      <w:r>
+        <w:t xml:space="preserve"> </w:t>
+      </w:r>
+      <w:r>
+        <w:t xml:space="preserve">on it.</w:t>
       </w:r>
     </w:p>
     <w:p>
@@ -2346,17 +2694,107 @@
         <w:pStyle w:val="Compact"/>
       </w:pPr>
       <w:r>
-        <w:rPr>
-          <w:bCs/>
-          <w:b/>
-        </w:rPr>
-        <w:t xml:space="preserve">-3, -4, -5:</w:t>
-      </w:r>
-      <w:r>
-        <w:t xml:space="preserve"> </w:t>
-      </w:r>
-      <w:r>
-        <w:t xml:space="preserve">your own pages, as before.</w:t>
+        <w:t xml:space="preserve">☐</w:t>
+      </w:r>
+      <w:r>
+        <w:t xml:space="preserve"> </w:t>
+      </w:r>
+      <w:r>
+        <w:rPr>
+          <w:rStyle w:val="VerbatimChar"/>
+          <w:bCs/>
+          <w:b/>
+        </w:rPr>
+        <w:t xml:space="preserve">-old</w:t>
+      </w:r>
+      <w:r>
+        <w:rPr>
+          <w:bCs/>
+          <w:b/>
+        </w:rPr>
+        <w:t xml:space="preserve"> </w:t>
+      </w:r>
+      <w:r>
+        <w:rPr>
+          <w:bCs/>
+          <w:b/>
+        </w:rPr>
+        <w:t xml:space="preserve">product:</w:t>
+      </w:r>
+      <w:r>
+        <w:t xml:space="preserve"> </w:t>
+      </w:r>
+      <w:r>
+        <w:t xml:space="preserve">after the switch,</w:t>
+      </w:r>
+      <w:r>
+        <w:t xml:space="preserve"> </w:t>
+      </w:r>
+      <w:r>
+        <w:rPr>
+          <w:rStyle w:val="VerbatimChar"/>
+        </w:rPr>
+        <w:t xml:space="preserve">muto-3</w:t>
+      </w:r>
+      <w:r>
+        <w:t xml:space="preserve"> </w:t>
+      </w:r>
+      <w:r>
+        <w:t xml:space="preserve">is on both</w:t>
+      </w:r>
+      <w:r>
+        <w:t xml:space="preserve"> </w:t>
+      </w:r>
+      <w:r>
+        <w:rPr>
+          <w:rStyle w:val="VerbatimChar"/>
+        </w:rPr>
+        <w:t xml:space="preserve">-old</w:t>
+      </w:r>
+      <w:r>
+        <w:t xml:space="preserve"> </w:t>
+      </w:r>
+      <w:r>
+        <w:t xml:space="preserve">and</w:t>
+      </w:r>
+      <w:r>
+        <w:t xml:space="preserve"> </w:t>
+      </w:r>
+      <w:r>
+        <w:rPr>
+          <w:rStyle w:val="VerbatimChar"/>
+        </w:rPr>
+        <w:t xml:space="preserve">-3</w:t>
+      </w:r>
+      <w:r>
+        <w:t xml:space="preserve">. Leave</w:t>
+      </w:r>
+      <w:r>
+        <w:t xml:space="preserve"> </w:t>
+      </w:r>
+      <w:r>
+        <w:rPr>
+          <w:rStyle w:val="VerbatimChar"/>
+        </w:rPr>
+        <w:t xml:space="preserve">-old</w:t>
+      </w:r>
+      <w:r>
+        <w:t xml:space="preserve"> </w:t>
+      </w:r>
+      <w:r>
+        <w:t xml:space="preserve">as it is, or redirect it to</w:t>
+      </w:r>
+      <w:r>
+        <w:t xml:space="preserve"> </w:t>
+      </w:r>
+      <w:r>
+        <w:rPr>
+          <w:rStyle w:val="VerbatimChar"/>
+        </w:rPr>
+        <w:t xml:space="preserve">-3</w:t>
+      </w:r>
+      <w:r>
+        <w:t xml:space="preserve">.</w:t>
       </w:r>
     </w:p>
     <w:p>
@@ -2368,24 +2806,40 @@
         <w:pStyle w:val="Compact"/>
       </w:pPr>
       <w:r>
-        <w:rPr>
-          <w:bCs/>
-          <w:b/>
-        </w:rPr>
-        <w:t xml:space="preserve">Add to cart</w:t>
-      </w:r>
-      <w:r>
-        <w:t xml:space="preserve"> </w:t>
-      </w:r>
-      <w:r>
-        <w:t xml:space="preserve">works on all five, with the welcome kit added.</w:t>
+        <w:t xml:space="preserve">☐</w:t>
+      </w:r>
+      <w:r>
+        <w:t xml:space="preserve"> </w:t>
+      </w:r>
+      <w:r>
+        <w:rPr>
+          <w:bCs/>
+          <w:b/>
+        </w:rPr>
+        <w:t xml:space="preserve">Ads and links:</w:t>
+      </w:r>
+      <w:r>
+        <w:t xml:space="preserve"> </w:t>
+      </w:r>
+      <w:r>
+        <w:t xml:space="preserve">anything pointing at the main page will show the new copy straight away. Any ad that should keep the old creatine-kit copy needs its own product and URL.</w:t>
+      </w:r>
+    </w:p>
+    <w:bookmarkEnd w:id="30"/>
+    <w:bookmarkStart w:id="31" w:name="check-after-publishing"/>
+    <w:p>
+      <w:pPr>
+        <w:pStyle w:val="Heading1"/>
+      </w:pPr>
+      <w:r>
+        <w:t xml:space="preserve">Check after publishing</w:t>
       </w:r>
     </w:p>
     <w:p>
       <w:pPr>
         <w:numPr>
           <w:ilvl w:val="0"/>
-          <w:numId w:val="1007"/>
+          <w:numId w:val="1008"/>
         </w:numPr>
         <w:pStyle w:val="Compact"/>
       </w:pPr>
@@ -2394,6 +2848,188 @@
           <w:bCs/>
           <w:b/>
         </w:rPr>
+        <w:t xml:space="preserve">Main page:</w:t>
+      </w:r>
+      <w:r>
+        <w:t xml:space="preserve"> </w:t>
+      </w:r>
+      <w:r>
+        <w:t xml:space="preserve">the intro starts</w:t>
+      </w:r>
+      <w:r>
+        <w:t xml:space="preserve"> </w:t>
+      </w:r>
+      <w:r>
+        <w:t xml:space="preserve">“</w:t>
+      </w:r>
+      <w:r>
+        <w:t xml:space="preserve">You’re doing more than ever</w:t>
+      </w:r>
+      <w:r>
+        <w:t xml:space="preserve">”</w:t>
+      </w:r>
+      <w:r>
+        <w:t xml:space="preserve">, the banner says £62, only the monthly plan shows, and the benefits tabs read</w:t>
+      </w:r>
+      <w:r>
+        <w:t xml:space="preserve"> </w:t>
+      </w:r>
+      <w:r>
+        <w:t xml:space="preserve">“</w:t>
+      </w:r>
+      <w:r>
+        <w:t xml:space="preserve">What you’ll feel</w:t>
+      </w:r>
+      <w:r>
+        <w:t xml:space="preserve">”</w:t>
+      </w:r>
+      <w:r>
+        <w:t xml:space="preserve"> </w:t>
+      </w:r>
+      <w:r>
+        <w:t xml:space="preserve">and</w:t>
+      </w:r>
+      <w:r>
+        <w:t xml:space="preserve"> </w:t>
+      </w:r>
+      <w:r>
+        <w:t xml:space="preserve">“</w:t>
+      </w:r>
+      <w:r>
+        <w:t xml:space="preserve">Check it your way</w:t>
+      </w:r>
+      <w:r>
+        <w:t xml:space="preserve">”</w:t>
+      </w:r>
+      <w:r>
+        <w:t xml:space="preserve">.</w:t>
+      </w:r>
+    </w:p>
+    <w:p>
+      <w:pPr>
+        <w:numPr>
+          <w:ilvl w:val="0"/>
+          <w:numId w:val="1008"/>
+        </w:numPr>
+        <w:pStyle w:val="Compact"/>
+      </w:pPr>
+      <w:r>
+        <w:rPr>
+          <w:bCs/>
+          <w:b/>
+        </w:rPr>
+        <w:t xml:space="preserve">-2:</w:t>
+      </w:r>
+      <w:r>
+        <w:t xml:space="preserve"> </w:t>
+      </w:r>
+      <w:r>
+        <w:t xml:space="preserve">“</w:t>
+      </w:r>
+      <w:r>
+        <w:t xml:space="preserve">You don’t feel old. So why so tired?</w:t>
+      </w:r>
+      <w:r>
+        <w:t xml:space="preserve">”</w:t>
+      </w:r>
+      <w:r>
+        <w:t xml:space="preserve"> </w:t>
+      </w:r>
+      <w:r>
+        <w:t xml:space="preserve">is the problem heading. The Garmin tile and the plain-English comparison table (</w:t>
+      </w:r>
+      <w:r>
+        <w:t xml:space="preserve">“</w:t>
+      </w:r>
+      <w:r>
+        <w:t xml:space="preserve">The easy way to get NAD⁺.</w:t>
+      </w:r>
+      <w:r>
+        <w:t xml:space="preserve">”</w:t>
+      </w:r>
+      <w:r>
+        <w:t xml:space="preserve">) show, the text is visibly larger, and the trust pills each sit on one line on desktop.</w:t>
+      </w:r>
+    </w:p>
+    <w:p>
+      <w:pPr>
+        <w:numPr>
+          <w:ilvl w:val="0"/>
+          <w:numId w:val="1008"/>
+        </w:numPr>
+        <w:pStyle w:val="Compact"/>
+      </w:pPr>
+      <w:r>
+        <w:rPr>
+          <w:bCs/>
+          <w:b/>
+        </w:rPr>
+        <w:t xml:space="preserve">-3, -4, -5:</w:t>
+      </w:r>
+      <w:r>
+        <w:t xml:space="preserve"> </w:t>
+      </w:r>
+      <w:r>
+        <w:t xml:space="preserve">your own pages, as before.</w:t>
+      </w:r>
+    </w:p>
+    <w:p>
+      <w:pPr>
+        <w:numPr>
+          <w:ilvl w:val="0"/>
+          <w:numId w:val="1008"/>
+        </w:numPr>
+        <w:pStyle w:val="Compact"/>
+      </w:pPr>
+      <w:r>
+        <w:rPr>
+          <w:bCs/>
+          <w:b/>
+        </w:rPr>
+        <w:t xml:space="preserve">Carousels:</w:t>
+      </w:r>
+      <w:r>
+        <w:t xml:space="preserve"> </w:t>
+      </w:r>
+      <w:r>
+        <w:t xml:space="preserve">each page shows its own product’s images. As a test, reorder the images on -2 and check that main doesn’t change.</w:t>
+      </w:r>
+    </w:p>
+    <w:p>
+      <w:pPr>
+        <w:numPr>
+          <w:ilvl w:val="0"/>
+          <w:numId w:val="1008"/>
+        </w:numPr>
+        <w:pStyle w:val="Compact"/>
+      </w:pPr>
+      <w:r>
+        <w:rPr>
+          <w:bCs/>
+          <w:b/>
+        </w:rPr>
+        <w:t xml:space="preserve">Add to cart</w:t>
+      </w:r>
+      <w:r>
+        <w:t xml:space="preserve"> </w:t>
+      </w:r>
+      <w:r>
+        <w:t xml:space="preserve">works on all five, with the welcome kit added.</w:t>
+      </w:r>
+    </w:p>
+    <w:p>
+      <w:pPr>
+        <w:numPr>
+          <w:ilvl w:val="0"/>
+          <w:numId w:val="1008"/>
+        </w:numPr>
+        <w:pStyle w:val="Compact"/>
+      </w:pPr>
+      <w:r>
+        <w:rPr>
+          <w:bCs/>
+          <w:b/>
+        </w:rPr>
         <w:t xml:space="preserve">On a phone:</w:t>
       </w:r>
       <w:r>
@@ -2403,7 +3039,7 @@
         <w:t xml:space="preserve">check -2 for wrapping in the plan cards and gift labels.</w:t>
       </w:r>
     </w:p>
-    <w:bookmarkEnd w:id="30"/>
+    <w:bookmarkEnd w:id="31"/>
     <w:sectPr/>
   </w:body>
 </w:document>
@@ -2693,6 +3329,9 @@
     <w:abstractNumId w:val="991"/>
   </w:num>
   <w:num w:numId="1007">
+    <w:abstractNumId w:val="991"/>
+  </w:num>
+  <w:num w:numId="1008">
     <w:abstractNumId w:val="99411"/>
     <w:lvlOverride w:ilvl="0">
       <w:startOverride w:val="1"/>

</xml_diff>